<commit_message>
Updated slide 07 and purged large master video
</commit_message>
<xml_diff>
--- a/Slides Outlines.docx
+++ b/Slides Outlines.docx
@@ -666,21 +666,7 @@
           <w:b/>
           <w:bCs/>
         </w:rPr>
-        <w:t xml:space="preserve">4. </w:t>
-      </w:r>
-      <w:r>
-        <w:rPr>
-          <w:b/>
-          <w:bCs/>
-        </w:rPr>
-        <w:t>Unnecessary</w:t>
-      </w:r>
-      <w:r>
-        <w:rPr>
-          <w:b/>
-          <w:bCs/>
-        </w:rPr>
-        <w:t xml:space="preserve"> Testing</w:t>
+        <w:t>4. Unnecessary Testing</w:t>
       </w:r>
     </w:p>
     <w:p>
@@ -2882,7 +2868,7 @@
       </w:pPr>
       <w:r>
         <w:pict w14:anchorId="5EBF796D">
-          <v:rect id="_x0000_i1031" style="width:0;height:1.5pt" o:hralign="center" o:hrstd="t" o:hr="t" fillcolor="#cfcfcf" stroked="f"/>
+          <v:rect id="_x0000_i1025" style="width:0;height:1.5pt" o:hralign="center" o:hrstd="t" o:hr="t" fillcolor="#cfcfcf" stroked="f"/>
         </w:pict>
       </w:r>
     </w:p>
@@ -3200,7 +3186,13 @@
       <w:pPr>
         <w:pStyle w:val="Heading3"/>
       </w:pPr>
-      <w:r>
+    </w:p>
+    <w:p>
+      <w:pPr>
+        <w:pStyle w:val="Heading3"/>
+      </w:pPr>
+      <w:r>
+        <w:lastRenderedPageBreak/>
         <w:t>Slide 9: Validation - Proving the Demand</w:t>
       </w:r>
     </w:p>
@@ -3213,7 +3205,6 @@
           <w:i/>
           <w:iCs/>
         </w:rPr>
-        <w:lastRenderedPageBreak/>
         <w:t>(Mapped to: Present evidence from tests, pilots, interviews, user feedback, or early results)</w:t>
       </w:r>
     </w:p>
@@ -3537,6 +3528,7 @@
           <w:b/>
           <w:bCs/>
         </w:rPr>
+        <w:lastRenderedPageBreak/>
         <w:t>Rule Alignment:</w:t>
       </w:r>
       <w:r>
@@ -3560,7 +3552,6 @@
           <w:sz w:val="26"/>
           <w:szCs w:val="26"/>
         </w:rPr>
-        <w:lastRenderedPageBreak/>
         <w:t>Months 1–2: BUILD (Engineering the Core)</w:t>
       </w:r>
     </w:p>
@@ -3922,6 +3913,7 @@
           <w:b/>
           <w:bCs/>
         </w:rPr>
+        <w:lastRenderedPageBreak/>
         <w:t>Rule Alignment:</w:t>
       </w:r>
       <w:r>
@@ -3945,7 +3937,6 @@
           <w:sz w:val="24"/>
           <w:szCs w:val="24"/>
         </w:rPr>
-        <w:lastRenderedPageBreak/>
         <w:t>1. Member 1: Toki Tahmid Ornob (Systems Architect &amp; Product Lead)</w:t>
       </w:r>
     </w:p>
@@ -4023,25 +4014,7 @@
           <w:sz w:val="24"/>
           <w:szCs w:val="24"/>
         </w:rPr>
-        <w:t>2. Member 2: Tabasum</w:t>
-      </w:r>
-      <w:r>
-        <w:rPr>
-          <w:b/>
-          <w:bCs/>
-          <w:sz w:val="24"/>
-          <w:szCs w:val="24"/>
-        </w:rPr>
-        <w:t xml:space="preserve"> Aktar</w:t>
-      </w:r>
-      <w:r>
-        <w:rPr>
-          <w:b/>
-          <w:bCs/>
-          <w:sz w:val="24"/>
-          <w:szCs w:val="24"/>
-        </w:rPr>
-        <w:t xml:space="preserve"> (Lead Developer &amp; Security Architect)</w:t>
+        <w:t>2. Member 2: Tabasum Aktar (Lead Developer &amp; Security Architect)</w:t>
       </w:r>
     </w:p>
     <w:p>
@@ -4349,6 +4322,7 @@
           <w:b/>
           <w:bCs/>
         </w:rPr>
+        <w:lastRenderedPageBreak/>
         <w:t>Why we need it:</w:t>
       </w:r>
       <w:r>
@@ -4387,7 +4361,6 @@
         <w:pStyle w:val="Heading4"/>
       </w:pPr>
       <w:r>
-        <w:lastRenderedPageBreak/>
         <w:t>4. Technical Lab &amp; Hardware Support (Resilience Testing)</w:t>
       </w:r>
     </w:p>

</xml_diff>